<commit_message>
MONO NEGOCIOS: plantilla contrato Garzón con tablas de turnos referenciales
Turnos = catálogo JEREZ (leído de gen_plantillas_jerez.py como fuente única).
Punteos de funciones ahora con viñetas Word en ambas plantillas MONO.
Sirve PT/FT (HORAS_SEMANALES) y plazo fijo/indefinido (TIPO_CONTRATO).

Co-Authored-By: Claude Fable 5 <noreply@anthropic.com>
</commit_message>
<xml_diff>
--- a/app/plantillas/MONO NEGOCIOS 77096809-7/CONTRATO Atencion del Local (PT-FT).docx
+++ b/app/plantillas/MONO NEGOCIOS 77096809-7/CONTRATO Atencion del Local (PT-FT).docx
@@ -77,45 +77,125 @@
       </w:pPr>
       <w:r>
         <w:rPr>
-          <w:b w:val="0"/>
+          <w:b/>
         </w:rPr>
         <w:t>1. Atención al cliente y servicio a la mesa.</w:t>
       </w:r>
     </w:p>
     <w:p>
       <w:pPr>
-        <w:ind w:left="600"/>
+        <w:pStyle w:val="ListBullet"/>
+        <w:ind w:left="720"/>
+        <w:jc w:val="both"/>
+      </w:pPr>
+      <w:r>
+        <w:t>Recepción cordial de clientes, entrega de cartas/menús y asesoría sobre los productos de la cafetería.</w:t>
+      </w:r>
+    </w:p>
+    <w:p>
+      <w:pPr>
+        <w:pStyle w:val="ListBullet"/>
+        <w:ind w:left="720"/>
+        <w:jc w:val="both"/>
+      </w:pPr>
+      <w:r>
+        <w:t>Toma de pedidos de manera ágil y exacta, ingresándolas en el sistema de comanda correspondiente.</w:t>
+      </w:r>
+    </w:p>
+    <w:p>
+      <w:pPr>
+        <w:pStyle w:val="ListBullet"/>
+        <w:ind w:left="720"/>
+        <w:jc w:val="both"/>
+      </w:pPr>
+      <w:r>
+        <w:t>Servicio de alimentos y bebidas (café, pastelería, sándwiches, etc.) en mesa o barra, cumpliendo con los estándares de presentación de la Empresa.</w:t>
+      </w:r>
+    </w:p>
+    <w:p>
+      <w:pPr>
+        <w:ind w:left="360"/>
         <w:jc w:val="both"/>
       </w:pPr>
       <w:r>
         <w:rPr>
-          <w:b w:val="0"/>
+          <w:b/>
         </w:rPr>
-        <w:t>- Recepción cordial de clientes, entrega de cartas/menús y asesoría sobre los productos de la cafetería.</w:t>
+        <w:t>2. Operación y Caja.</w:t>
       </w:r>
     </w:p>
     <w:p>
       <w:pPr>
-        <w:ind w:left="600"/>
+        <w:pStyle w:val="ListBullet"/>
+        <w:ind w:left="720"/>
+        <w:jc w:val="both"/>
+      </w:pPr>
+      <w:r>
+        <w:t>Entrega de la cuenta y cobro de los servicios a través de los medios de pago disponibles (efectivo, tarjetas, transferencias).</w:t>
+      </w:r>
+    </w:p>
+    <w:p>
+      <w:pPr>
+        <w:pStyle w:val="ListBullet"/>
+        <w:ind w:left="720"/>
+        <w:jc w:val="both"/>
+      </w:pPr>
+      <w:r>
+        <w:t>Apoyo en la barra para la preparación básica de pedidos rápidos o despacho de productos envasados si la operación lo requiere.</w:t>
+      </w:r>
+    </w:p>
+    <w:p>
+      <w:pPr>
+        <w:ind w:left="360"/>
         <w:jc w:val="both"/>
       </w:pPr>
       <w:r>
         <w:rPr>
-          <w:b w:val="0"/>
+          <w:b/>
         </w:rPr>
-        <w:t>- Toma de pedidos de manera ágil y exacta, ingresándolas en el sistema de comanda correspondiente.</w:t>
+        <w:t>3. Higiene y Orden.</w:t>
       </w:r>
     </w:p>
     <w:p>
       <w:pPr>
-        <w:ind w:left="600"/>
+        <w:pStyle w:val="ListBullet"/>
+        <w:ind w:left="720"/>
+        <w:jc w:val="both"/>
+      </w:pPr>
+      <w:r>
+        <w:t>Montaje, desmontaje y limpieza profunda de mesas y sillas inmediatamente después de su uso.</w:t>
+      </w:r>
+    </w:p>
+    <w:p>
+      <w:pPr>
+        <w:pStyle w:val="ListBullet"/>
+        <w:ind w:left="720"/>
+        <w:jc w:val="both"/>
+      </w:pPr>
+      <w:r>
+        <w:t>Mantención del aseo general del salón, barra y estaciones de trabajo, asegurando el cumplimiento de las normas sanitarias vigentes.</w:t>
+      </w:r>
+    </w:p>
+    <w:p>
+      <w:pPr>
+        <w:pStyle w:val="ListBullet"/>
+        <w:ind w:left="720"/>
+        <w:jc w:val="both"/>
+      </w:pPr>
+      <w:r>
+        <w:t>Orden y reposición de insumos (servilletas, azúcar, cubiertos, vitrinas) antes, durante y al cierre del turno.</w:t>
+      </w:r>
+    </w:p>
+    <w:p>
+      <w:pPr>
+        <w:ind w:left="360"/>
         <w:jc w:val="both"/>
       </w:pPr>
       <w:r>
         <w:rPr>
-          <w:b w:val="0"/>
+          <w:b/>
         </w:rPr>
-        <w:t>- Servicio de alimentos y bebidas (café, pastelería, sándwiches, etc.) en mesa o barra, cumpliendo con los estándares de presentación de la Empresa.</w:t>
+        <w:t xml:space="preserve">4. Funciones conexas: </w:t>
       </w:r>
     </w:p>
     <w:p>
@@ -127,91 +207,7 @@
         <w:rPr>
           <w:b w:val="0"/>
         </w:rPr>
-        <w:t>2. Operación y Caja.</w:t>
-      </w:r>
-    </w:p>
-    <w:p>
-      <w:pPr>
-        <w:ind w:left="600"/>
-        <w:jc w:val="both"/>
-      </w:pPr>
-      <w:r>
-        <w:rPr>
-          <w:b w:val="0"/>
-        </w:rPr>
-        <w:t>- Entrega de la cuenta y cobro de los servicios a través de los medios de pago disponibles (efectivo, tarjetas, transferencias).</w:t>
-      </w:r>
-    </w:p>
-    <w:p>
-      <w:pPr>
-        <w:ind w:left="600"/>
-        <w:jc w:val="both"/>
-      </w:pPr>
-      <w:r>
-        <w:rPr>
-          <w:b w:val="0"/>
-        </w:rPr>
-        <w:t>- Apoyo en la barra para la preparación básica de pedidos rápidos o despacho de productos envasados si la operación lo requiere.</w:t>
-      </w:r>
-    </w:p>
-    <w:p>
-      <w:pPr>
-        <w:ind w:left="360"/>
-        <w:jc w:val="both"/>
-      </w:pPr>
-      <w:r>
-        <w:rPr>
-          <w:b w:val="0"/>
-        </w:rPr>
-        <w:t>3. Higiene y Orden.</w:t>
-      </w:r>
-    </w:p>
-    <w:p>
-      <w:pPr>
-        <w:ind w:left="600"/>
-        <w:jc w:val="both"/>
-      </w:pPr>
-      <w:r>
-        <w:rPr>
-          <w:b w:val="0"/>
-        </w:rPr>
-        <w:t>- Montaje, desmontaje y limpieza profunda de mesas y sillas inmediatamente después de su uso.</w:t>
-      </w:r>
-    </w:p>
-    <w:p>
-      <w:pPr>
-        <w:ind w:left="600"/>
-        <w:jc w:val="both"/>
-      </w:pPr>
-      <w:r>
-        <w:rPr>
-          <w:b w:val="0"/>
-        </w:rPr>
-        <w:t>- Mantención del aseo general del salón, barra y estaciones de trabajo, asegurando el cumplimiento de las normas sanitarias vigentes.</w:t>
-      </w:r>
-    </w:p>
-    <w:p>
-      <w:pPr>
-        <w:ind w:left="600"/>
-        <w:jc w:val="both"/>
-      </w:pPr>
-      <w:r>
-        <w:rPr>
-          <w:b w:val="0"/>
-        </w:rPr>
-        <w:t>- Orden y reposición de insumos (servilletas, azúcar, cubiertos, vitrinas) antes, durante y al cierre del turno.</w:t>
-      </w:r>
-    </w:p>
-    <w:p>
-      <w:pPr>
-        <w:ind w:left="360"/>
-        <w:jc w:val="both"/>
-      </w:pPr>
-      <w:r>
-        <w:rPr>
-          <w:b w:val="0"/>
-        </w:rPr>
-        <w:t>4. Funciones conexas: El Trabajador acepta colaborar en tareas conexas ante necesidades operativas, tales como apoyo en inventarios generales, cierre de local y verificación de aseo.</w:t>
+        <w:t>El Trabajador acepta colaborar en tareas conexas ante necesidades operativas, tales como apoyo en inventarios generales, cierre de local y verificación de aseo.</w:t>
       </w:r>
     </w:p>
     <w:p>

</xml_diff>

<commit_message>
MONO: direcciones y ciudad de firma a placeholders + variantes extranjero
CIUDAD_FIRMA en el encabezado y DIRECCION_EMPRESA/COMUNA_EMPRESA en
encabezado y cláusula PRIMERO (antes hardcodeadas Reñaca / Carrera Pinto 184).
Nuevas plantillas Garzón Extranjero y Atención del Local Extranjero con la
cláusula especial de trabajador extranjero (visa / Ley 18.156 / 13,5 UTM).

Co-Authored-By: Claude Fable 5 <noreply@anthropic.com>
</commit_message>
<xml_diff>
--- a/app/plantillas/MONO NEGOCIOS 77096809-7/CONTRATO Atencion del Local (PT-FT).docx
+++ b/app/plantillas/MONO NEGOCIOS 77096809-7/CONTRATO Atencion del Local (PT-FT).docx
@@ -30,7 +30,7 @@
         <w:jc w:val="both"/>
       </w:pPr>
       <w:r>
-        <w:t>En Reñaca, a {FECHA_INICIO_CONTRATO}, entre {RAZON_SOCIAL}, RUT {RUT_EMPRESA}, representada por don {NOMBRE_REP_LEGAL}, Rut: {RUT_REP_LEGAL}, ambos domiciliados en Avenida Ignacio Carrera Pinto N° 184, Reñaca, Viña del Mar, correo electrónico {EMAIL_EMPRESA}, que en adelante se denominará "el empleador", y don(ña) {NOMBRE_EMPLEADO}, de nacionalidad {NACIONALIDAD_EMPLEADO}, Rut {RUT_EMPLEADO}, fecha de nacimiento {FECHA_NACIMIENTO}, de estado civil {ESTADO_CIVIL}, con domicilio {DIRECCION_EMPLEADO}, comuna de {COMUNA_EMPLEADO}, correo electrónico {EMAILPERSONAL_EMPLEADO}, que en adelante se denominará "el trabajador", se ha convenido en el siguiente contrato de trabajo:</w:t>
+        <w:t>En {CIUDAD_FIRMA}, a {FECHA_INICIO_CONTRATO}, entre {RAZON_SOCIAL}, RUT {RUT_EMPRESA}, representada por don {NOMBRE_REP_LEGAL}, Rut: {RUT_REP_LEGAL}, ambos domiciliados en {DIRECCION_EMPRESA}, comuna de {COMUNA_EMPRESA}, correo electrónico {EMAIL_EMPRESA}, que en adelante se denominará "el empleador", y don(ña) {NOMBRE_EMPLEADO}, de nacionalidad {NACIONALIDAD_EMPLEADO}, Rut {RUT_EMPLEADO}, fecha de nacimiento {FECHA_NACIMIENTO}, de estado civil {ESTADO_CIVIL}, con domicilio {DIRECCION_EMPLEADO}, comuna de {COMUNA_EMPLEADO}, correo electrónico {EMAILPERSONAL_EMPLEADO}, que en adelante se denominará "el trabajador", se ha convenido en el siguiente contrato de trabajo:</w:t>
       </w:r>
     </w:p>
     <w:p/>
@@ -45,7 +45,7 @@
         <w:t xml:space="preserve">PRIMERO: Naturaleza de los Servicios. </w:t>
       </w:r>
       <w:r>
-        <w:t>El Trabajador se compromete y obliga a realizar el trabajo como {CARGO}, desempeñando labores en el área indicada por el empleador y otras del giro, las cuales han de prestarse en las dependencias del empleador, ubicadas en Avenida Ignacio Carrera Pinto N° 184, Reñaca, Viña del Mar. El trabajador podrá ser trasladado a otro domicilio o labores similares, dentro de la ciudad, por causa justificada, sin que ello importe menoscabo para el trabajador.</w:t>
+        <w:t>El Trabajador se compromete y obliga a realizar el trabajo como {CARGO}, desempeñando labores en el área indicada por el empleador y otras del giro, las cuales han de prestarse en las dependencias del empleador, ubicadas en {DIRECCION_EMPRESA}, comuna de {COMUNA_EMPRESA}. El trabajador podrá ser trasladado a otro domicilio o labores similares, dentro de la ciudad, por causa justificada, sin que ello importe menoscabo para el trabajador.</w:t>
       </w:r>
     </w:p>
     <w:p>

</xml_diff>

<commit_message>
Plantillas MONO: clausula PREVISION Y SALUD en los 4 contratos
Regla RSTL (Cristian 13-07-2026): toda plantilla de contrato debe llevar
la clausula de prevision ({PREVISION}/{INSTITUCION_SALUD}). Auditadas las
36 plantillas de contrato activas: solo faltaba en las 4 de MONO
(Atencion del Local y Garzon, chileno/extranjero). Se agrega como
DECIMO SEGUNDO y se renumeran las clausulas siguientes.

Co-Authored-By: Claude Fable 5 <noreply@anthropic.com>
</commit_message>
<xml_diff>
--- a/app/plantillas/MONO NEGOCIOS 77096809-7/CONTRATO Atencion del Local (PT-FT).docx
+++ b/app/plantillas/MONO NEGOCIOS 77096809-7/CONTRATO Atencion del Local (PT-FT).docx
@@ -651,7 +651,22 @@
         <w:rPr>
           <w:b/>
         </w:rPr>
-        <w:t xml:space="preserve">DÉCIMO SEGUNDO: </w:t>
+        <w:t xml:space="preserve">DÉCIMO SEGUNDO: PREVISIÓN Y SALUD. </w:t>
+      </w:r>
+      <w:r>
+        <w:t>Se deja constancia que el trabajador cotizará en {PREVISION} y en el sistema de salud {INSTITUCION_SALUD}.</w:t>
+      </w:r>
+    </w:p>
+    <w:p/>
+    <w:p>
+      <w:pPr>
+        <w:jc w:val="both"/>
+      </w:pPr>
+      <w:r>
+        <w:rPr>
+          <w:b/>
+        </w:rPr>
+        <w:t xml:space="preserve">DÉCIMO TERCERO: </w:t>
       </w:r>
       <w:r>
         <w:t>Para todos los efectos legales derivados de este contrato, las partes fijan su domicilio en la ciudad y comuna de Viña del Mar, sometiéndose a la jurisdicción y competencia de sus Tribunales de Justicia.</w:t>
@@ -666,7 +681,7 @@
         <w:rPr>
           <w:b/>
         </w:rPr>
-        <w:t xml:space="preserve">DÉCIMO TERCERO: </w:t>
+        <w:t xml:space="preserve">DÉCIMO CUARTO: </w:t>
       </w:r>
       <w:r>
         <w:t>Se suscribe este instrumento en dos ejemplares de igual tenor, quedando uno de ellos en poder del empleador y el restante en poder del trabajador, quien declara recibirlo en este acto.</w:t>

</xml_diff>